<commit_message>
docs: add mermaid architecture diagram and screenshot placeholders
</commit_message>
<xml_diff>
--- a/REPORT.docx
+++ b/REPORT.docx
@@ -149,16 +149,90 @@
           <w:b/>
           <w:bCs/>
         </w:rPr>
-        <w:t xml:space="preserve">Data Flow:</w:t>
-      </w:r>
-      <w:r>
-        <w:t xml:space="preserve"> </w:t>
-      </w:r>
-      <w:r>
-        <w:rPr>
-          <w:rStyle w:val="VerbatimChar"/>
-        </w:rPr>
-        <w:t xml:space="preserve">PDF Document → PyMuPDFLoader → SlidingWindowChunker → LocalEmbedder → ChromaDB (Vector Store) → Query Expansion (Retriever) → LLM Generator → Grounded Answer</w:t>
+        <w:t xml:space="preserve">Data Flow Diagram:</w:t>
+      </w:r>
+    </w:p>
+    <w:p>
+      <w:pPr>
+        <w:pStyle w:val="SourceCode"/>
+      </w:pPr>
+      <w:r>
+        <w:rPr>
+          <w:rStyle w:val="VerbatimChar"/>
+        </w:rPr>
+        <w:t xml:space="preserve">graph TD</w:t>
+      </w:r>
+      <w:r>
+        <w:br/>
+      </w:r>
+      <w:r>
+        <w:rPr>
+          <w:rStyle w:val="VerbatimChar"/>
+        </w:rPr>
+        <w:t xml:space="preserve">    A[PDF Document] --&gt;|PyMuPDFLoader| B(Raw Text)</w:t>
+      </w:r>
+      <w:r>
+        <w:br/>
+      </w:r>
+      <w:r>
+        <w:rPr>
+          <w:rStyle w:val="VerbatimChar"/>
+        </w:rPr>
+        <w:t xml:space="preserve">    B --&gt;|SlidingWindowChunker| C(Text Chunks)</w:t>
+      </w:r>
+      <w:r>
+        <w:br/>
+      </w:r>
+      <w:r>
+        <w:rPr>
+          <w:rStyle w:val="VerbatimChar"/>
+        </w:rPr>
+        <w:t xml:space="preserve">    C --&gt;|LocalEmbedder| D[(ChromaDB Vector Store)]</w:t>
+      </w:r>
+      <w:r>
+        <w:br/>
+      </w:r>
+      <w:r>
+        <w:rPr>
+          <w:rStyle w:val="VerbatimChar"/>
+        </w:rPr>
+        <w:t xml:space="preserve">    </w:t>
+      </w:r>
+      <w:r>
+        <w:br/>
+      </w:r>
+      <w:r>
+        <w:rPr>
+          <w:rStyle w:val="VerbatimChar"/>
+        </w:rPr>
+        <w:t xml:space="preserve">    E[User Query] --&gt;|Retriever| F{Query Expansion}</w:t>
+      </w:r>
+      <w:r>
+        <w:br/>
+      </w:r>
+      <w:r>
+        <w:rPr>
+          <w:rStyle w:val="VerbatimChar"/>
+        </w:rPr>
+        <w:t xml:space="preserve">    F --&gt;|Multiple Sub-queries| D</w:t>
+      </w:r>
+      <w:r>
+        <w:br/>
+      </w:r>
+      <w:r>
+        <w:rPr>
+          <w:rStyle w:val="VerbatimChar"/>
+        </w:rPr>
+        <w:t xml:space="preserve">    D --&gt;|Top-k Unique Chunks| G(LLM Generator)</w:t>
+      </w:r>
+      <w:r>
+        <w:br/>
+      </w:r>
+      <w:r>
+        <w:rPr>
+          <w:rStyle w:val="VerbatimChar"/>
+        </w:rPr>
+        <w:t xml:space="preserve">    G --&gt; H[Grounded Answer]</w:t>
       </w:r>
     </w:p>
     <w:bookmarkStart w:id="11" w:name="Xc20175da7c420b746fb7f5e05360c821d5342df"/>

</xml_diff>